<commit_message>
feat(so): add address field cover page to signatures template
</commit_message>
<xml_diff>
--- a/document-merge-service/kt_so/templatefiles/signatures.docx
+++ b/document-merge-service/kt_so/templatefiles/signatures.docx
@@ -4,6 +4,64 @@
   <w:body>
     <w:p>
       <w:pPr>
+        <w:pStyle w:val="BodyText"/>
+        <w:rPr/>
+      </w:pPr>
+      <w:r>
+        <w:rPr/>
+        <w:t>{{ addressRecipient }</w:t>
+      </w:r>
+      <w:r>
+        <w:rPr/>
+        <w:t>}</w:t>
+      </w:r>
+    </w:p>
+    <w:p>
+      <w:pPr>
+        <w:pStyle w:val="BodyText"/>
+        <w:rPr/>
+      </w:pPr>
+      <w:r>
+        <w:rPr/>
+        <w:t>{{ address</w:t>
+      </w:r>
+      <w:r>
+        <w:rPr/>
+        <w:t>Street</w:t>
+      </w:r>
+      <w:r>
+        <w:rPr/>
+        <w:t xml:space="preserve"> }}</w:t>
+      </w:r>
+    </w:p>
+    <w:p>
+      <w:pPr>
+        <w:sectPr>
+          <w:type w:val="nextPage"/>
+          <w:pgSz w:orient="landscape" w:w="12983" w:h="9184"/>
+          <w:pgMar w:left="1361" w:right="7370" w:gutter="0" w:header="0" w:top="3005" w:footer="0" w:bottom="3288"/>
+          <w:pgNumType w:fmt="decimal"/>
+          <w:formProt w:val="false"/>
+          <w:textDirection w:val="lrTb"/>
+        </w:sectPr>
+        <w:pStyle w:val="BodyText"/>
+        <w:rPr/>
+      </w:pPr>
+      <w:r>
+        <w:rPr/>
+        <w:t>{{ address</w:t>
+      </w:r>
+      <w:r>
+        <w:rPr/>
+        <w:t>CityZip</w:t>
+      </w:r>
+      <w:r>
+        <w:rPr/>
+        <w:t xml:space="preserve"> }}</w:t>
+      </w:r>
+    </w:p>
+    <w:p>
+      <w:pPr>
         <w:pStyle w:val="Title"/>
         <w:spacing w:before="2160" w:after="288"/>
         <w:jc w:val="left"/>
@@ -11,15 +69,18 @@
       </w:pPr>
       <w:r>
         <w:rPr/>
-        <w:t xml:space="preserve">{{ caseType }} {{ </w:t>
-      </w:r>
-      <w:r>
-        <w:rPr/>
-        <w:t>dossierNr</w:t>
-      </w:r>
-      <w:r>
-        <w:rPr/>
-        <w:t xml:space="preserve"> }}</w:t>
+      </w:r>
+    </w:p>
+    <w:p>
+      <w:pPr>
+        <w:pStyle w:val="Title"/>
+        <w:spacing w:before="2160" w:after="288"/>
+        <w:jc w:val="left"/>
+        <w:rPr/>
+      </w:pPr>
+      <w:r>
+        <w:rPr/>
+        <w:t>{{ caseType }} {{ dossierNr }}</w:t>
       </w:r>
     </w:p>
     <w:p>
@@ -66,7 +127,7 @@
               <w:widowControl w:val="false"/>
               <w:numPr>
                 <w:ilvl w:val="2"/>
-                <w:numId w:val="4"/>
+                <w:numId w:val="5"/>
               </w:numPr>
               <w:rPr>
                 <w:b w:val="false"/>
@@ -99,7 +160,7 @@
               <w:widowControl w:val="false"/>
               <w:numPr>
                 <w:ilvl w:val="2"/>
-                <w:numId w:val="4"/>
+                <w:numId w:val="5"/>
               </w:numPr>
               <w:rPr>
                 <w:b w:val="false"/>
@@ -190,7 +251,7 @@
               <w:widowControl w:val="false"/>
               <w:numPr>
                 <w:ilvl w:val="3"/>
-                <w:numId w:val="4"/>
+                <w:numId w:val="5"/>
               </w:numPr>
               <w:rPr>
                 <w:b w:val="false"/>
@@ -223,7 +284,7 @@
               <w:widowControl w:val="false"/>
               <w:numPr>
                 <w:ilvl w:val="3"/>
-                <w:numId w:val="4"/>
+                <w:numId w:val="5"/>
               </w:numPr>
               <w:rPr>
                 <w:rFonts w:ascii="Liberation Sans" w:hAnsi="Liberation Sans" w:eastAsia="Noto Sans CJK SC Regular" w:cs="Arial"/>
@@ -256,7 +317,7 @@
               <w:widowControl w:val="false"/>
               <w:numPr>
                 <w:ilvl w:val="3"/>
-                <w:numId w:val="4"/>
+                <w:numId w:val="5"/>
               </w:numPr>
               <w:rPr>
                 <w:b w:val="false"/>
@@ -298,7 +359,7 @@
               <w:widowControl w:val="false"/>
               <w:numPr>
                 <w:ilvl w:val="2"/>
-                <w:numId w:val="4"/>
+                <w:numId w:val="5"/>
               </w:numPr>
               <w:rPr>
                 <w:rFonts w:ascii="Liberation Sans" w:hAnsi="Liberation Sans" w:eastAsia="Noto Sans CJK SC Regular" w:cs="Arial"/>
@@ -331,7 +392,7 @@
               <w:widowControl w:val="false"/>
               <w:numPr>
                 <w:ilvl w:val="2"/>
-                <w:numId w:val="4"/>
+                <w:numId w:val="5"/>
               </w:numPr>
               <w:rPr>
                 <w:b w:val="false"/>
@@ -364,7 +425,7 @@
               <w:widowControl w:val="false"/>
               <w:numPr>
                 <w:ilvl w:val="2"/>
-                <w:numId w:val="4"/>
+                <w:numId w:val="5"/>
               </w:numPr>
               <w:rPr>
                 <w:rFonts w:ascii="Liberation Sans" w:hAnsi="Liberation Sans" w:eastAsia="Noto Sans CJK SC Regular" w:cs="Arial"/>
@@ -397,7 +458,7 @@
               <w:widowControl w:val="false"/>
               <w:numPr>
                 <w:ilvl w:val="2"/>
-                <w:numId w:val="4"/>
+                <w:numId w:val="5"/>
               </w:numPr>
               <w:rPr>
                 <w:rFonts w:ascii="Liberation Sans" w:hAnsi="Liberation Sans" w:eastAsia="Noto Sans CJK SC Regular" w:cs="Arial"/>
@@ -433,7 +494,7 @@
               <w:widowControl w:val="false"/>
               <w:numPr>
                 <w:ilvl w:val="3"/>
-                <w:numId w:val="4"/>
+                <w:numId w:val="5"/>
               </w:numPr>
               <w:rPr>
                 <w:rFonts w:ascii="Liberation Sans" w:hAnsi="Liberation Sans" w:eastAsia="Noto Sans CJK SC Regular" w:cs="Arial"/>
@@ -459,7 +520,7 @@
               <w:widowControl w:val="false"/>
               <w:numPr>
                 <w:ilvl w:val="3"/>
-                <w:numId w:val="4"/>
+                <w:numId w:val="5"/>
               </w:numPr>
               <w:rPr>
                 <w:rFonts w:ascii="Liberation Sans" w:hAnsi="Liberation Sans" w:eastAsia="Noto Sans CJK SC Regular" w:cs="Arial"/>
@@ -494,7 +555,7 @@
               <w:widowControl w:val="false"/>
               <w:numPr>
                 <w:ilvl w:val="2"/>
-                <w:numId w:val="4"/>
+                <w:numId w:val="5"/>
               </w:numPr>
               <w:rPr>
                 <w:rFonts w:ascii="Liberation Sans" w:hAnsi="Liberation Sans" w:eastAsia="Noto Sans CJK SC Regular" w:cs="Arial"/>
@@ -528,7 +589,7 @@
               <w:widowControl w:val="false"/>
               <w:numPr>
                 <w:ilvl w:val="2"/>
-                <w:numId w:val="4"/>
+                <w:numId w:val="5"/>
               </w:numPr>
               <w:rPr>
                 <w:rFonts w:ascii="Liberation Sans" w:hAnsi="Liberation Sans" w:eastAsia="Noto Sans CJK SC Regular" w:cs="Arial"/>
@@ -561,7 +622,7 @@
               <w:widowControl w:val="false"/>
               <w:numPr>
                 <w:ilvl w:val="3"/>
-                <w:numId w:val="4"/>
+                <w:numId w:val="5"/>
               </w:numPr>
               <w:rPr>
                 <w:rFonts w:ascii="Liberation Sans" w:hAnsi="Liberation Sans" w:eastAsia="Noto Sans CJK SC Regular" w:cs="Arial"/>
@@ -587,7 +648,7 @@
               <w:widowControl w:val="false"/>
               <w:numPr>
                 <w:ilvl w:val="3"/>
-                <w:numId w:val="4"/>
+                <w:numId w:val="5"/>
               </w:numPr>
               <w:rPr>
                 <w:rFonts w:ascii="Liberation Sans" w:hAnsi="Liberation Sans" w:eastAsia="Noto Sans CJK SC Regular" w:cs="Arial"/>
@@ -623,7 +684,7 @@
               <w:widowControl w:val="false"/>
               <w:numPr>
                 <w:ilvl w:val="3"/>
-                <w:numId w:val="4"/>
+                <w:numId w:val="5"/>
               </w:numPr>
               <w:rPr>
                 <w:rFonts w:ascii="Liberation Sans" w:hAnsi="Liberation Sans" w:eastAsia="Noto Sans CJK SC Regular" w:cs="Arial"/>
@@ -649,7 +710,7 @@
               <w:widowControl w:val="false"/>
               <w:numPr>
                 <w:ilvl w:val="3"/>
-                <w:numId w:val="4"/>
+                <w:numId w:val="5"/>
               </w:numPr>
               <w:rPr>
                 <w:rFonts w:ascii="Liberation Sans" w:hAnsi="Liberation Sans" w:eastAsia="Noto Sans CJK SC Regular" w:cs="Arial"/>
@@ -690,7 +751,7 @@
         <w:pStyle w:val="Heading1"/>
         <w:numPr>
           <w:ilvl w:val="0"/>
-          <w:numId w:val="5"/>
+          <w:numId w:val="6"/>
         </w:numPr>
         <w:spacing w:before="0" w:after="720"/>
         <w:rPr/>
@@ -889,7 +950,7 @@
         <w:pStyle w:val="Heading1"/>
         <w:numPr>
           <w:ilvl w:val="0"/>
-          <w:numId w:val="5"/>
+          <w:numId w:val="6"/>
         </w:numPr>
         <w:rPr/>
       </w:pPr>
@@ -951,7 +1012,7 @@
         <w:widowControl w:val="false"/>
         <w:numPr>
           <w:ilvl w:val="2"/>
-          <w:numId w:val="4"/>
+          <w:numId w:val="5"/>
         </w:numPr>
         <w:suppressAutoHyphens w:val="true"/>
         <w:spacing w:before="0" w:after="0"/>
@@ -1199,7 +1260,7 @@
     </w:r>
     <w:r>
       <w:rPr/>
-      <w:t>2</w:t>
+      <w:t>3</w:t>
     </w:r>
     <w:r>
       <w:rPr/>
@@ -1227,7 +1288,7 @@
     </w:r>
     <w:r>
       <w:rPr/>
-      <w:t>2</w:t>
+      <w:t>3</w:t>
     </w:r>
     <w:r>
       <w:rPr/>
@@ -1265,7 +1326,7 @@
     </w:r>
     <w:r>
       <w:rPr/>
-      <w:t>2</w:t>
+      <w:t>3</w:t>
     </w:r>
     <w:r>
       <w:rPr/>
@@ -1293,7 +1354,7 @@
     </w:r>
     <w:r>
       <w:rPr/>
-      <w:t>2</w:t>
+      <w:t>3</w:t>
     </w:r>
     <w:r>
       <w:rPr/>
@@ -1376,8 +1437,8 @@
                       <w:txbxContent>
                         <w:p>
                           <w:pPr>
-                            <w:pStyle w:val="FrameContents"/>
-                            <w:overflowPunct w:val="false"/>
+                            <w:pStyle w:val="FrameContentsuser"/>
+                            <w:overflowPunct w:val="true"/>
                             <w:jc w:val="right"/>
                             <w:rPr>
                               <w:sz w:val="12"/>
@@ -1413,8 +1474,8 @@
                 <w:txbxContent>
                   <w:p>
                     <w:pPr>
-                      <w:pStyle w:val="FrameContents"/>
-                      <w:overflowPunct w:val="false"/>
+                      <w:pStyle w:val="FrameContentsuser"/>
+                      <w:overflowPunct w:val="true"/>
                       <w:jc w:val="right"/>
                       <w:rPr>
                         <w:sz w:val="12"/>
@@ -1438,7 +1499,7 @@
         </mc:Fallback>
       </mc:AlternateContent>
       <w:drawing>
-        <wp:anchor behindDoc="1" distT="0" distB="0" distL="0" distR="0" simplePos="0" locked="0" layoutInCell="0" allowOverlap="1" relativeHeight="8">
+        <wp:anchor behindDoc="1" distT="0" distB="0" distL="0" distR="0" simplePos="0" locked="0" layoutInCell="0" allowOverlap="1" relativeHeight="7">
           <wp:simplePos x="0" y="0"/>
           <wp:positionH relativeFrom="column">
             <wp:posOffset>0</wp:posOffset>
@@ -1542,8 +1603,8 @@
                       <w:txbxContent>
                         <w:p>
                           <w:pPr>
-                            <w:pStyle w:val="FrameContents"/>
-                            <w:overflowPunct w:val="false"/>
+                            <w:pStyle w:val="FrameContentsuser"/>
+                            <w:overflowPunct w:val="true"/>
                             <w:jc w:val="right"/>
                             <w:rPr>
                               <w:sz w:val="12"/>
@@ -1579,8 +1640,8 @@
                 <w:txbxContent>
                   <w:p>
                     <w:pPr>
-                      <w:pStyle w:val="FrameContents"/>
-                      <w:overflowPunct w:val="false"/>
+                      <w:pStyle w:val="FrameContentsuser"/>
+                      <w:overflowPunct w:val="true"/>
                       <w:jc w:val="right"/>
                       <w:rPr>
                         <w:sz w:val="12"/>
@@ -1604,7 +1665,7 @@
         </mc:Fallback>
       </mc:AlternateContent>
       <w:drawing>
-        <wp:anchor behindDoc="1" distT="0" distB="0" distL="0" distR="0" simplePos="0" locked="0" layoutInCell="0" allowOverlap="1" relativeHeight="8">
+        <wp:anchor behindDoc="1" distT="0" distB="0" distL="0" distR="0" simplePos="0" locked="0" layoutInCell="0" allowOverlap="1" relativeHeight="7">
           <wp:simplePos x="0" y="0"/>
           <wp:positionH relativeFrom="column">
             <wp:posOffset>0</wp:posOffset>
@@ -1669,7 +1730,6 @@
         </w:tabs>
         <w:ind w:left="0" w:hanging="0"/>
       </w:pPr>
-      <w:rPr/>
     </w:lvl>
     <w:lvl w:ilvl="1">
       <w:start w:val="1"/>
@@ -1683,7 +1743,6 @@
         </w:tabs>
         <w:ind w:left="0" w:hanging="0"/>
       </w:pPr>
-      <w:rPr/>
     </w:lvl>
     <w:lvl w:ilvl="2">
       <w:start w:val="1"/>
@@ -1697,7 +1756,6 @@
         </w:tabs>
         <w:ind w:left="0" w:hanging="0"/>
       </w:pPr>
-      <w:rPr/>
     </w:lvl>
     <w:lvl w:ilvl="3">
       <w:start w:val="1"/>
@@ -1711,7 +1769,6 @@
         </w:tabs>
         <w:ind w:left="0" w:hanging="0"/>
       </w:pPr>
-      <w:rPr/>
     </w:lvl>
     <w:lvl w:ilvl="4">
       <w:start w:val="1"/>
@@ -1725,7 +1782,6 @@
         </w:tabs>
         <w:ind w:left="0" w:hanging="0"/>
       </w:pPr>
-      <w:rPr/>
     </w:lvl>
     <w:lvl w:ilvl="5">
       <w:start w:val="1"/>
@@ -1739,7 +1795,6 @@
         </w:tabs>
         <w:ind w:left="0" w:hanging="0"/>
       </w:pPr>
-      <w:rPr/>
     </w:lvl>
     <w:lvl w:ilvl="6">
       <w:start w:val="1"/>
@@ -1753,7 +1808,6 @@
         </w:tabs>
         <w:ind w:left="0" w:hanging="0"/>
       </w:pPr>
-      <w:rPr/>
     </w:lvl>
     <w:lvl w:ilvl="7">
       <w:start w:val="1"/>
@@ -1767,7 +1821,6 @@
         </w:tabs>
         <w:ind w:left="0" w:hanging="0"/>
       </w:pPr>
-      <w:rPr/>
     </w:lvl>
     <w:lvl w:ilvl="8">
       <w:start w:val="1"/>
@@ -1781,7 +1834,6 @@
         </w:tabs>
         <w:ind w:left="0" w:hanging="0"/>
       </w:pPr>
-      <w:rPr/>
     </w:lvl>
   </w:abstractNum>
   <w:abstractNum w:abstractNumId="2">
@@ -2309,6 +2361,7 @@
         </w:tabs>
         <w:ind w:left="0" w:hanging="0"/>
       </w:pPr>
+      <w:rPr/>
     </w:lvl>
     <w:lvl w:ilvl="1">
       <w:start w:val="1"/>
@@ -2322,6 +2375,7 @@
         </w:tabs>
         <w:ind w:left="0" w:hanging="0"/>
       </w:pPr>
+      <w:rPr/>
     </w:lvl>
     <w:lvl w:ilvl="2">
       <w:start w:val="1"/>
@@ -2335,6 +2389,7 @@
         </w:tabs>
         <w:ind w:left="0" w:hanging="0"/>
       </w:pPr>
+      <w:rPr/>
     </w:lvl>
     <w:lvl w:ilvl="3">
       <w:start w:val="1"/>
@@ -2348,6 +2403,7 @@
         </w:tabs>
         <w:ind w:left="0" w:hanging="0"/>
       </w:pPr>
+      <w:rPr/>
     </w:lvl>
     <w:lvl w:ilvl="4">
       <w:start w:val="1"/>
@@ -2361,6 +2417,7 @@
         </w:tabs>
         <w:ind w:left="0" w:hanging="0"/>
       </w:pPr>
+      <w:rPr/>
     </w:lvl>
     <w:lvl w:ilvl="5">
       <w:start w:val="1"/>
@@ -2374,6 +2431,7 @@
         </w:tabs>
         <w:ind w:left="0" w:hanging="0"/>
       </w:pPr>
+      <w:rPr/>
     </w:lvl>
     <w:lvl w:ilvl="6">
       <w:start w:val="1"/>
@@ -2387,6 +2445,7 @@
         </w:tabs>
         <w:ind w:left="0" w:hanging="0"/>
       </w:pPr>
+      <w:rPr/>
     </w:lvl>
     <w:lvl w:ilvl="7">
       <w:start w:val="1"/>
@@ -2400,6 +2459,7 @@
         </w:tabs>
         <w:ind w:left="0" w:hanging="0"/>
       </w:pPr>
+      <w:rPr/>
     </w:lvl>
     <w:lvl w:ilvl="8">
       <w:start w:val="1"/>
@@ -2413,6 +2473,7 @@
         </w:tabs>
         <w:ind w:left="0" w:hanging="0"/>
       </w:pPr>
+      <w:rPr/>
     </w:lvl>
   </w:abstractNum>
   <w:num w:numId="1">
@@ -2481,7 +2542,7 @@
     <w:pPr>
       <w:numPr>
         <w:ilvl w:val="0"/>
-        <w:numId w:val="3"/>
+        <w:numId w:val="4"/>
       </w:numPr>
       <w:spacing w:before="1440" w:after="720"/>
       <w:outlineLvl w:val="0"/>
@@ -2501,7 +2562,7 @@
     <w:pPr>
       <w:numPr>
         <w:ilvl w:val="1"/>
-        <w:numId w:val="1"/>
+        <w:numId w:val="2"/>
       </w:numPr>
       <w:spacing w:before="576" w:after="288"/>
       <w:outlineLvl w:val="1"/>
@@ -2521,7 +2582,7 @@
       <w:widowControl w:val="false"/>
       <w:numPr>
         <w:ilvl w:val="2"/>
-        <w:numId w:val="4"/>
+        <w:numId w:val="5"/>
       </w:numPr>
       <w:suppressAutoHyphens w:val="true"/>
       <w:spacing w:before="0" w:after="0"/>
@@ -2542,7 +2603,7 @@
     <w:pPr>
       <w:numPr>
         <w:ilvl w:val="3"/>
-        <w:numId w:val="2"/>
+        <w:numId w:val="3"/>
       </w:numPr>
       <w:spacing w:before="120" w:after="120"/>
       <w:outlineLvl w:val="3"/>
@@ -2634,8 +2695,8 @@
     </w:pPr>
     <w:rPr/>
   </w:style>
-  <w:style w:type="paragraph" w:styleId="BlockQuotation">
-    <w:name w:val="Block Quotation"/>
+  <w:style w:type="paragraph" w:styleId="BlockQuotationuser">
+    <w:name w:val="Block Quotation (user)"/>
     <w:basedOn w:val="Normal"/>
     <w:qFormat/>
     <w:pPr>
@@ -2739,6 +2800,13 @@
     </w:pPr>
     <w:rPr/>
   </w:style>
+  <w:style w:type="paragraph" w:styleId="FrameContentsuser">
+    <w:name w:val="Frame Contents (user)"/>
+    <w:basedOn w:val="Normal"/>
+    <w:qFormat/>
+    <w:pPr/>
+    <w:rPr/>
+  </w:style>
   <w:style w:type="paragraph" w:styleId="FrameContents">
     <w:name w:val="Frame Contents"/>
     <w:basedOn w:val="Normal"/>
@@ -2746,9 +2814,10 @@
     <w:pPr/>
     <w:rPr/>
   </w:style>
-  <w:style w:type="paragraph" w:styleId="FrameContentsuser">
-    <w:name w:val="Frame Contents (user)"/>
+  <w:style w:type="paragraph" w:styleId="C5Envelope">
+    <w:name w:val="C5 Envelope"/>
     <w:basedOn w:val="Normal"/>
+    <w:next w:val="Normal"/>
     <w:qFormat/>
     <w:pPr/>
     <w:rPr/>

</xml_diff>

<commit_message>
fix(dms): signatures template address cover page to A4
</commit_message>
<xml_diff>
--- a/document-merge-service/kt_so/templatefiles/signatures.docx
+++ b/document-merge-service/kt_so/templatefiles/signatures.docx
@@ -9,11 +9,7 @@
       </w:pPr>
       <w:r>
         <w:rPr/>
-        <w:t>{{ addressRecipient }</w:t>
-      </w:r>
-      <w:r>
-        <w:rPr/>
-        <w:t>}</w:t>
+        <w:t>{{ addressRecipient }}</w:t>
       </w:r>
     </w:p>
     <w:p>
@@ -23,41 +19,26 @@
       </w:pPr>
       <w:r>
         <w:rPr/>
-        <w:t>{{ address</w:t>
-      </w:r>
-      <w:r>
-        <w:rPr/>
-        <w:t>Street</w:t>
-      </w:r>
-      <w:r>
-        <w:rPr/>
-        <w:t xml:space="preserve"> }}</w:t>
+        <w:t>{{ addressStreet }}</w:t>
       </w:r>
     </w:p>
     <w:p>
       <w:pPr>
         <w:sectPr>
           <w:type w:val="nextPage"/>
-          <w:pgSz w:orient="landscape" w:w="12983" w:h="9184"/>
-          <w:pgMar w:left="1361" w:right="7370" w:gutter="0" w:header="0" w:top="3005" w:footer="0" w:bottom="3288"/>
+          <w:pgSz w:w="11906" w:h="16838"/>
+          <w:pgMar w:left="1361" w:right="7370" w:gutter="0" w:header="0" w:top="3005" w:footer="0" w:bottom="11849"/>
           <w:pgNumType w:fmt="decimal"/>
           <w:formProt w:val="false"/>
           <w:textDirection w:val="lrTb"/>
+          <w:docGrid w:type="default" w:linePitch="100" w:charSpace="0"/>
         </w:sectPr>
         <w:pStyle w:val="BodyText"/>
         <w:rPr/>
       </w:pPr>
       <w:r>
         <w:rPr/>
-        <w:t>{{ address</w:t>
-      </w:r>
-      <w:r>
-        <w:rPr/>
-        <w:t>CityZip</w:t>
-      </w:r>
-      <w:r>
-        <w:rPr/>
-        <w:t xml:space="preserve"> }}</w:t>
+        <w:t>{{ addressCityZip }}</w:t>
       </w:r>
     </w:p>
     <w:p>
@@ -127,7 +108,7 @@
               <w:widowControl w:val="false"/>
               <w:numPr>
                 <w:ilvl w:val="2"/>
-                <w:numId w:val="5"/>
+                <w:numId w:val="4"/>
               </w:numPr>
               <w:rPr>
                 <w:b w:val="false"/>
@@ -160,7 +141,7 @@
               <w:widowControl w:val="false"/>
               <w:numPr>
                 <w:ilvl w:val="2"/>
-                <w:numId w:val="5"/>
+                <w:numId w:val="4"/>
               </w:numPr>
               <w:rPr>
                 <w:b w:val="false"/>
@@ -251,7 +232,7 @@
               <w:widowControl w:val="false"/>
               <w:numPr>
                 <w:ilvl w:val="3"/>
-                <w:numId w:val="5"/>
+                <w:numId w:val="4"/>
               </w:numPr>
               <w:rPr>
                 <w:b w:val="false"/>
@@ -284,7 +265,7 @@
               <w:widowControl w:val="false"/>
               <w:numPr>
                 <w:ilvl w:val="3"/>
-                <w:numId w:val="5"/>
+                <w:numId w:val="4"/>
               </w:numPr>
               <w:rPr>
                 <w:rFonts w:ascii="Liberation Sans" w:hAnsi="Liberation Sans" w:eastAsia="Noto Sans CJK SC Regular" w:cs="Arial"/>
@@ -317,7 +298,7 @@
               <w:widowControl w:val="false"/>
               <w:numPr>
                 <w:ilvl w:val="3"/>
-                <w:numId w:val="5"/>
+                <w:numId w:val="4"/>
               </w:numPr>
               <w:rPr>
                 <w:b w:val="false"/>
@@ -359,7 +340,7 @@
               <w:widowControl w:val="false"/>
               <w:numPr>
                 <w:ilvl w:val="2"/>
-                <w:numId w:val="5"/>
+                <w:numId w:val="4"/>
               </w:numPr>
               <w:rPr>
                 <w:rFonts w:ascii="Liberation Sans" w:hAnsi="Liberation Sans" w:eastAsia="Noto Sans CJK SC Regular" w:cs="Arial"/>
@@ -392,7 +373,7 @@
               <w:widowControl w:val="false"/>
               <w:numPr>
                 <w:ilvl w:val="2"/>
-                <w:numId w:val="5"/>
+                <w:numId w:val="4"/>
               </w:numPr>
               <w:rPr>
                 <w:b w:val="false"/>
@@ -425,7 +406,7 @@
               <w:widowControl w:val="false"/>
               <w:numPr>
                 <w:ilvl w:val="2"/>
-                <w:numId w:val="5"/>
+                <w:numId w:val="4"/>
               </w:numPr>
               <w:rPr>
                 <w:rFonts w:ascii="Liberation Sans" w:hAnsi="Liberation Sans" w:eastAsia="Noto Sans CJK SC Regular" w:cs="Arial"/>
@@ -458,7 +439,7 @@
               <w:widowControl w:val="false"/>
               <w:numPr>
                 <w:ilvl w:val="2"/>
-                <w:numId w:val="5"/>
+                <w:numId w:val="4"/>
               </w:numPr>
               <w:rPr>
                 <w:rFonts w:ascii="Liberation Sans" w:hAnsi="Liberation Sans" w:eastAsia="Noto Sans CJK SC Regular" w:cs="Arial"/>
@@ -494,7 +475,7 @@
               <w:widowControl w:val="false"/>
               <w:numPr>
                 <w:ilvl w:val="3"/>
-                <w:numId w:val="5"/>
+                <w:numId w:val="4"/>
               </w:numPr>
               <w:rPr>
                 <w:rFonts w:ascii="Liberation Sans" w:hAnsi="Liberation Sans" w:eastAsia="Noto Sans CJK SC Regular" w:cs="Arial"/>
@@ -520,7 +501,7 @@
               <w:widowControl w:val="false"/>
               <w:numPr>
                 <w:ilvl w:val="3"/>
-                <w:numId w:val="5"/>
+                <w:numId w:val="4"/>
               </w:numPr>
               <w:rPr>
                 <w:rFonts w:ascii="Liberation Sans" w:hAnsi="Liberation Sans" w:eastAsia="Noto Sans CJK SC Regular" w:cs="Arial"/>
@@ -555,7 +536,7 @@
               <w:widowControl w:val="false"/>
               <w:numPr>
                 <w:ilvl w:val="2"/>
-                <w:numId w:val="5"/>
+                <w:numId w:val="4"/>
               </w:numPr>
               <w:rPr>
                 <w:rFonts w:ascii="Liberation Sans" w:hAnsi="Liberation Sans" w:eastAsia="Noto Sans CJK SC Regular" w:cs="Arial"/>
@@ -589,7 +570,7 @@
               <w:widowControl w:val="false"/>
               <w:numPr>
                 <w:ilvl w:val="2"/>
-                <w:numId w:val="5"/>
+                <w:numId w:val="4"/>
               </w:numPr>
               <w:rPr>
                 <w:rFonts w:ascii="Liberation Sans" w:hAnsi="Liberation Sans" w:eastAsia="Noto Sans CJK SC Regular" w:cs="Arial"/>
@@ -622,7 +603,7 @@
               <w:widowControl w:val="false"/>
               <w:numPr>
                 <w:ilvl w:val="3"/>
-                <w:numId w:val="5"/>
+                <w:numId w:val="4"/>
               </w:numPr>
               <w:rPr>
                 <w:rFonts w:ascii="Liberation Sans" w:hAnsi="Liberation Sans" w:eastAsia="Noto Sans CJK SC Regular" w:cs="Arial"/>
@@ -648,7 +629,7 @@
               <w:widowControl w:val="false"/>
               <w:numPr>
                 <w:ilvl w:val="3"/>
-                <w:numId w:val="5"/>
+                <w:numId w:val="4"/>
               </w:numPr>
               <w:rPr>
                 <w:rFonts w:ascii="Liberation Sans" w:hAnsi="Liberation Sans" w:eastAsia="Noto Sans CJK SC Regular" w:cs="Arial"/>
@@ -684,7 +665,7 @@
               <w:widowControl w:val="false"/>
               <w:numPr>
                 <w:ilvl w:val="3"/>
-                <w:numId w:val="5"/>
+                <w:numId w:val="4"/>
               </w:numPr>
               <w:rPr>
                 <w:rFonts w:ascii="Liberation Sans" w:hAnsi="Liberation Sans" w:eastAsia="Noto Sans CJK SC Regular" w:cs="Arial"/>
@@ -710,7 +691,7 @@
               <w:widowControl w:val="false"/>
               <w:numPr>
                 <w:ilvl w:val="3"/>
-                <w:numId w:val="5"/>
+                <w:numId w:val="4"/>
               </w:numPr>
               <w:rPr>
                 <w:rFonts w:ascii="Liberation Sans" w:hAnsi="Liberation Sans" w:eastAsia="Noto Sans CJK SC Regular" w:cs="Arial"/>
@@ -751,7 +732,7 @@
         <w:pStyle w:val="Heading1"/>
         <w:numPr>
           <w:ilvl w:val="0"/>
-          <w:numId w:val="6"/>
+          <w:numId w:val="5"/>
         </w:numPr>
         <w:spacing w:before="0" w:after="720"/>
         <w:rPr/>
@@ -950,7 +931,7 @@
         <w:pStyle w:val="Heading1"/>
         <w:numPr>
           <w:ilvl w:val="0"/>
-          <w:numId w:val="6"/>
+          <w:numId w:val="5"/>
         </w:numPr>
         <w:rPr/>
       </w:pPr>
@@ -1012,7 +993,7 @@
         <w:widowControl w:val="false"/>
         <w:numPr>
           <w:ilvl w:val="2"/>
-          <w:numId w:val="5"/>
+          <w:numId w:val="4"/>
         </w:numPr>
         <w:suppressAutoHyphens w:val="true"/>
         <w:spacing w:before="0" w:after="0"/>
@@ -1260,7 +1241,7 @@
     </w:r>
     <w:r>
       <w:rPr/>
-      <w:t>3</w:t>
+      <w:t>2</w:t>
     </w:r>
     <w:r>
       <w:rPr/>
@@ -1326,7 +1307,7 @@
     </w:r>
     <w:r>
       <w:rPr/>
-      <w:t>3</w:t>
+      <w:t>2</w:t>
     </w:r>
     <w:r>
       <w:rPr/>
@@ -1437,8 +1418,8 @@
                       <w:txbxContent>
                         <w:p>
                           <w:pPr>
-                            <w:pStyle w:val="FrameContentsuser"/>
-                            <w:overflowPunct w:val="true"/>
+                            <w:pStyle w:val="FrameContents"/>
+                            <w:overflowPunct w:val="false"/>
                             <w:jc w:val="right"/>
                             <w:rPr>
                               <w:sz w:val="12"/>
@@ -1474,8 +1455,8 @@
                 <w:txbxContent>
                   <w:p>
                     <w:pPr>
-                      <w:pStyle w:val="FrameContentsuser"/>
-                      <w:overflowPunct w:val="true"/>
+                      <w:pStyle w:val="FrameContents"/>
+                      <w:overflowPunct w:val="false"/>
                       <w:jc w:val="right"/>
                       <w:rPr>
                         <w:sz w:val="12"/>
@@ -1603,8 +1584,8 @@
                       <w:txbxContent>
                         <w:p>
                           <w:pPr>
-                            <w:pStyle w:val="FrameContentsuser"/>
-                            <w:overflowPunct w:val="true"/>
+                            <w:pStyle w:val="FrameContents"/>
+                            <w:overflowPunct w:val="false"/>
                             <w:jc w:val="right"/>
                             <w:rPr>
                               <w:sz w:val="12"/>
@@ -1640,8 +1621,8 @@
                 <w:txbxContent>
                   <w:p>
                     <w:pPr>
-                      <w:pStyle w:val="FrameContentsuser"/>
-                      <w:overflowPunct w:val="true"/>
+                      <w:pStyle w:val="FrameContents"/>
+                      <w:overflowPunct w:val="false"/>
                       <w:jc w:val="right"/>
                       <w:rPr>
                         <w:sz w:val="12"/>
@@ -1730,6 +1711,7 @@
         </w:tabs>
         <w:ind w:left="0" w:hanging="0"/>
       </w:pPr>
+      <w:rPr/>
     </w:lvl>
     <w:lvl w:ilvl="1">
       <w:start w:val="1"/>
@@ -1743,6 +1725,7 @@
         </w:tabs>
         <w:ind w:left="0" w:hanging="0"/>
       </w:pPr>
+      <w:rPr/>
     </w:lvl>
     <w:lvl w:ilvl="2">
       <w:start w:val="1"/>
@@ -1756,6 +1739,7 @@
         </w:tabs>
         <w:ind w:left="0" w:hanging="0"/>
       </w:pPr>
+      <w:rPr/>
     </w:lvl>
     <w:lvl w:ilvl="3">
       <w:start w:val="1"/>
@@ -1769,6 +1753,7 @@
         </w:tabs>
         <w:ind w:left="0" w:hanging="0"/>
       </w:pPr>
+      <w:rPr/>
     </w:lvl>
     <w:lvl w:ilvl="4">
       <w:start w:val="1"/>
@@ -1782,6 +1767,7 @@
         </w:tabs>
         <w:ind w:left="0" w:hanging="0"/>
       </w:pPr>
+      <w:rPr/>
     </w:lvl>
     <w:lvl w:ilvl="5">
       <w:start w:val="1"/>
@@ -1795,6 +1781,7 @@
         </w:tabs>
         <w:ind w:left="0" w:hanging="0"/>
       </w:pPr>
+      <w:rPr/>
     </w:lvl>
     <w:lvl w:ilvl="6">
       <w:start w:val="1"/>
@@ -1808,6 +1795,7 @@
         </w:tabs>
         <w:ind w:left="0" w:hanging="0"/>
       </w:pPr>
+      <w:rPr/>
     </w:lvl>
     <w:lvl w:ilvl="7">
       <w:start w:val="1"/>
@@ -1821,6 +1809,7 @@
         </w:tabs>
         <w:ind w:left="0" w:hanging="0"/>
       </w:pPr>
+      <w:rPr/>
     </w:lvl>
     <w:lvl w:ilvl="8">
       <w:start w:val="1"/>
@@ -1834,6 +1823,7 @@
         </w:tabs>
         <w:ind w:left="0" w:hanging="0"/>
       </w:pPr>
+      <w:rPr/>
     </w:lvl>
   </w:abstractNum>
   <w:abstractNum w:abstractNumId="2">
@@ -2361,7 +2351,6 @@
         </w:tabs>
         <w:ind w:left="0" w:hanging="0"/>
       </w:pPr>
-      <w:rPr/>
     </w:lvl>
     <w:lvl w:ilvl="1">
       <w:start w:val="1"/>
@@ -2375,7 +2364,6 @@
         </w:tabs>
         <w:ind w:left="0" w:hanging="0"/>
       </w:pPr>
-      <w:rPr/>
     </w:lvl>
     <w:lvl w:ilvl="2">
       <w:start w:val="1"/>
@@ -2389,7 +2377,6 @@
         </w:tabs>
         <w:ind w:left="0" w:hanging="0"/>
       </w:pPr>
-      <w:rPr/>
     </w:lvl>
     <w:lvl w:ilvl="3">
       <w:start w:val="1"/>
@@ -2403,7 +2390,6 @@
         </w:tabs>
         <w:ind w:left="0" w:hanging="0"/>
       </w:pPr>
-      <w:rPr/>
     </w:lvl>
     <w:lvl w:ilvl="4">
       <w:start w:val="1"/>
@@ -2417,7 +2403,6 @@
         </w:tabs>
         <w:ind w:left="0" w:hanging="0"/>
       </w:pPr>
-      <w:rPr/>
     </w:lvl>
     <w:lvl w:ilvl="5">
       <w:start w:val="1"/>
@@ -2431,7 +2416,6 @@
         </w:tabs>
         <w:ind w:left="0" w:hanging="0"/>
       </w:pPr>
-      <w:rPr/>
     </w:lvl>
     <w:lvl w:ilvl="6">
       <w:start w:val="1"/>
@@ -2445,7 +2429,6 @@
         </w:tabs>
         <w:ind w:left="0" w:hanging="0"/>
       </w:pPr>
-      <w:rPr/>
     </w:lvl>
     <w:lvl w:ilvl="7">
       <w:start w:val="1"/>
@@ -2459,7 +2442,6 @@
         </w:tabs>
         <w:ind w:left="0" w:hanging="0"/>
       </w:pPr>
-      <w:rPr/>
     </w:lvl>
     <w:lvl w:ilvl="8">
       <w:start w:val="1"/>
@@ -2473,7 +2455,6 @@
         </w:tabs>
         <w:ind w:left="0" w:hanging="0"/>
       </w:pPr>
-      <w:rPr/>
     </w:lvl>
   </w:abstractNum>
   <w:num w:numId="1">
@@ -2542,7 +2523,7 @@
     <w:pPr>
       <w:numPr>
         <w:ilvl w:val="0"/>
-        <w:numId w:val="4"/>
+        <w:numId w:val="3"/>
       </w:numPr>
       <w:spacing w:before="1440" w:after="720"/>
       <w:outlineLvl w:val="0"/>
@@ -2562,7 +2543,7 @@
     <w:pPr>
       <w:numPr>
         <w:ilvl w:val="1"/>
-        <w:numId w:val="2"/>
+        <w:numId w:val="1"/>
       </w:numPr>
       <w:spacing w:before="576" w:after="288"/>
       <w:outlineLvl w:val="1"/>
@@ -2582,7 +2563,7 @@
       <w:widowControl w:val="false"/>
       <w:numPr>
         <w:ilvl w:val="2"/>
-        <w:numId w:val="5"/>
+        <w:numId w:val="4"/>
       </w:numPr>
       <w:suppressAutoHyphens w:val="true"/>
       <w:spacing w:before="0" w:after="0"/>
@@ -2603,7 +2584,7 @@
     <w:pPr>
       <w:numPr>
         <w:ilvl w:val="3"/>
-        <w:numId w:val="3"/>
+        <w:numId w:val="2"/>
       </w:numPr>
       <w:spacing w:before="120" w:after="120"/>
       <w:outlineLvl w:val="3"/>
@@ -2695,8 +2676,8 @@
     </w:pPr>
     <w:rPr/>
   </w:style>
-  <w:style w:type="paragraph" w:styleId="BlockQuotationuser">
-    <w:name w:val="Block Quotation (user)"/>
+  <w:style w:type="paragraph" w:styleId="BlockQuotation">
+    <w:name w:val="Block Quotation"/>
     <w:basedOn w:val="Normal"/>
     <w:qFormat/>
     <w:pPr>
@@ -2777,7 +2758,7 @@
     <w:pPr>
       <w:suppressLineNumbers/>
       <w:tabs>
-        <w:tab w:val="clear" w:pos="709"/>
+        <w:tab w:val="clear" w:pos="643"/>
         <w:tab w:val="center" w:pos="4819" w:leader="none"/>
         <w:tab w:val="right" w:pos="9638" w:leader="none"/>
       </w:tabs>
@@ -2800,15 +2781,15 @@
     </w:pPr>
     <w:rPr/>
   </w:style>
-  <w:style w:type="paragraph" w:styleId="FrameContentsuser">
-    <w:name w:val="Frame Contents (user)"/>
+  <w:style w:type="paragraph" w:styleId="FrameContents">
+    <w:name w:val="Frame Contents"/>
     <w:basedOn w:val="Normal"/>
     <w:qFormat/>
     <w:pPr/>
     <w:rPr/>
   </w:style>
-  <w:style w:type="paragraph" w:styleId="FrameContents">
-    <w:name w:val="Frame Contents"/>
+  <w:style w:type="paragraph" w:styleId="FrameContentsuser">
+    <w:name w:val="Frame Contents (user)"/>
     <w:basedOn w:val="Normal"/>
     <w:qFormat/>
     <w:pPr/>

</xml_diff>

<commit_message>
feat(so): add signature boxes for representation in the generated document
</commit_message>
<xml_diff>
--- a/document-merge-service/kt_so/templatefiles/signatures.docx
+++ b/document-merge-service/kt_so/templatefiles/signatures.docx
@@ -1,6 +1,6 @@
 
 <file path=word/document.xml><?xml version="1.0" encoding="utf-8"?>
-<w:document xmlns:o="urn:schemas-microsoft-com:office:office" xmlns:r="http://schemas.openxmlformats.org/officeDocument/2006/relationships" xmlns:v="urn:schemas-microsoft-com:vml" xmlns:w="http://schemas.openxmlformats.org/wordprocessingml/2006/main" xmlns:w10="urn:schemas-microsoft-com:office:word" xmlns:wp="http://schemas.openxmlformats.org/drawingml/2006/wordprocessingDrawing" xmlns:pic="http://schemas.openxmlformats.org/drawingml/2006/picture" xmlns:wps="http://schemas.microsoft.com/office/word/2010/wordprocessingShape" xmlns:wpg="http://schemas.microsoft.com/office/word/2010/wordprocessingGroup" xmlns:mc="http://schemas.openxmlformats.org/markup-compatibility/2006" xmlns:wp14="http://schemas.microsoft.com/office/word/2010/wordprocessingDrawing" xmlns:w14="http://schemas.microsoft.com/office/word/2010/wordml" xmlns:w15="http://schemas.microsoft.com/office/word/2012/wordml" mc:Ignorable="w14 wp14 w15">
+<w:document xmlns:o="urn:schemas-microsoft-com:office:office" xmlns:r="http://schemas.openxmlformats.org/officeDocument/2006/relationships" xmlns:v="urn:schemas-microsoft-com:vml" xmlns:w="http://schemas.openxmlformats.org/wordprocessingml/2006/main" xmlns:w10="urn:schemas-microsoft-com:office:word" xmlns:wp="http://schemas.openxmlformats.org/drawingml/2006/wordprocessingDrawing" xmlns:wps="http://schemas.microsoft.com/office/word/2010/wordprocessingShape" xmlns:wpg="http://schemas.microsoft.com/office/word/2010/wordprocessingGroup" xmlns:mc="http://schemas.openxmlformats.org/markup-compatibility/2006" xmlns:wp14="http://schemas.microsoft.com/office/word/2010/wordprocessingDrawing" xmlns:w14="http://schemas.microsoft.com/office/word/2010/wordml" xmlns:w15="http://schemas.microsoft.com/office/word/2012/wordml" mc:Ignorable="w14 wp14 w15">
   <w:body>
     <w:p>
       <w:pPr>
@@ -1133,6 +1133,230 @@
       </w:pPr>
       <w:r>
         <w:rPr/>
+        <w:t>{% if person.representationJuristicName or person.representationFamilyName or person.representationGivenName %}</w:t>
+      </w:r>
+    </w:p>
+    <w:p>
+      <w:pPr>
+        <w:pStyle w:val="Heading3"/>
+        <w:widowControl w:val="false"/>
+        <w:numPr>
+          <w:ilvl w:val="2"/>
+          <w:numId w:val="4"/>
+        </w:numPr>
+        <w:suppressAutoHyphens w:val="true"/>
+        <w:spacing w:before="0" w:after="0"/>
+        <w:ind w:hanging="0" w:left="0" w:right="0"/>
+        <w:rPr/>
+      </w:pPr>
+      <w:r>
+        <w:rPr/>
+        <w:t>Vertreten durch - {% if person.representation</w:t>
+      </w:r>
+      <w:r>
+        <w:rPr/>
+        <w:t>J</w:t>
+      </w:r>
+      <w:r>
+        <w:rPr/>
+        <w:t>uristicName %}</w:t>
+      </w:r>
+    </w:p>
+    <w:p>
+      <w:pPr>
+        <w:pStyle w:val="Heading3"/>
+        <w:widowControl w:val="false"/>
+        <w:numPr>
+          <w:ilvl w:val="2"/>
+          <w:numId w:val="4"/>
+        </w:numPr>
+        <w:suppressAutoHyphens w:val="true"/>
+        <w:spacing w:before="0" w:after="0"/>
+        <w:ind w:hanging="0" w:left="0" w:right="0"/>
+        <w:rPr/>
+      </w:pPr>
+      <w:r>
+        <w:rPr/>
+        <w:t>{{ person.</w:t>
+      </w:r>
+      <w:r>
+        <w:rPr/>
+        <w:t>representationJ</w:t>
+      </w:r>
+      <w:r>
+        <w:rPr/>
+        <w:t xml:space="preserve">uristicName }}, </w:t>
+      </w:r>
+      <w:r>
+        <w:rPr/>
+        <w:t>{{person.representationGivenName}} {{person.representationFamilyName}}</w:t>
+      </w:r>
+      <w:r>
+        <w:rPr/>
+        <w:t xml:space="preserve">{% </w:t>
+      </w:r>
+      <w:r>
+        <w:rPr/>
+        <w:t>else</w:t>
+      </w:r>
+      <w:r>
+        <w:rPr/>
+        <w:t xml:space="preserve"> %}{{ person.</w:t>
+      </w:r>
+      <w:r>
+        <w:rPr/>
+        <w:t>representationG</w:t>
+      </w:r>
+      <w:r>
+        <w:rPr/>
+        <w:t>ivenName }} {{ person.</w:t>
+      </w:r>
+      <w:r>
+        <w:rPr/>
+        <w:t>representationF</w:t>
+      </w:r>
+      <w:r>
+        <w:rPr/>
+        <w:t>amilyName }}{% endif %}</w:t>
+      </w:r>
+    </w:p>
+    <w:tbl>
+      <w:tblPr>
+        <w:tblW w:w="8910" w:type="dxa"/>
+        <w:jc w:val="left"/>
+        <w:tblInd w:w="0" w:type="dxa"/>
+        <w:tblLayout w:type="fixed"/>
+        <w:tblCellMar>
+          <w:top w:w="173" w:type="dxa"/>
+          <w:left w:w="173" w:type="dxa"/>
+          <w:bottom w:w="173" w:type="dxa"/>
+          <w:right w:w="173" w:type="dxa"/>
+        </w:tblCellMar>
+        <w:tblLook w:val="04a0" w:noHBand="0" w:noVBand="1" w:firstColumn="1" w:lastRow="0" w:lastColumn="0" w:firstRow="1"/>
+      </w:tblPr>
+      <w:tblGrid>
+        <w:gridCol w:w="4947"/>
+        <w:gridCol w:w="3962"/>
+      </w:tblGrid>
+      <w:tr>
+        <w:trPr/>
+        <w:tc>
+          <w:tcPr>
+            <w:tcW w:w="4947" w:type="dxa"/>
+            <w:tcBorders/>
+            <w:shd w:color="auto" w:fill="DDDDDD" w:val="clear"/>
+          </w:tcPr>
+          <w:p>
+            <w:pPr>
+              <w:pStyle w:val="TableContents"/>
+              <w:widowControl w:val="false"/>
+              <w:rPr/>
+            </w:pPr>
+            <w:r>
+              <w:rPr/>
+              <w:t>{{ signatureMetadata }}</w:t>
+            </w:r>
+          </w:p>
+          <w:p>
+            <w:pPr>
+              <w:pStyle w:val="TableContents"/>
+              <w:widowControl w:val="false"/>
+              <w:pBdr>
+                <w:bottom w:val="dotted" w:sz="2" w:space="8" w:color="000000"/>
+              </w:pBdr>
+              <w:suppressAutoHyphens w:val="true"/>
+              <w:rPr>
+                <w:rFonts w:ascii="Liberation Sans" w:hAnsi="Liberation Sans"/>
+                <w:sz w:val="18"/>
+                <w:szCs w:val="18"/>
+              </w:rPr>
+            </w:pPr>
+            <w:r>
+              <w:rPr>
+                <w:rFonts w:ascii="Liberation Sans" w:hAnsi="Liberation Sans"/>
+                <w:sz w:val="18"/>
+                <w:szCs w:val="18"/>
+              </w:rPr>
+            </w:r>
+          </w:p>
+        </w:tc>
+        <w:tc>
+          <w:tcPr>
+            <w:tcW w:w="3962" w:type="dxa"/>
+            <w:tcBorders/>
+            <w:shd w:color="auto" w:fill="DDDDDD" w:val="clear"/>
+          </w:tcPr>
+          <w:p>
+            <w:pPr>
+              <w:pStyle w:val="TableContents"/>
+              <w:widowControl w:val="false"/>
+              <w:rPr/>
+            </w:pPr>
+            <w:r>
+              <w:rPr/>
+              <w:t>{{ signatureTitle }}</w:t>
+            </w:r>
+          </w:p>
+          <w:p>
+            <w:pPr>
+              <w:pStyle w:val="TableContents"/>
+              <w:widowControl w:val="false"/>
+              <w:pBdr>
+                <w:bottom w:val="dotted" w:sz="2" w:space="8" w:color="000000"/>
+              </w:pBdr>
+              <w:suppressAutoHyphens w:val="true"/>
+              <w:rPr>
+                <w:rFonts w:ascii="Liberation Sans" w:hAnsi="Liberation Sans"/>
+                <w:sz w:val="18"/>
+                <w:szCs w:val="18"/>
+              </w:rPr>
+            </w:pPr>
+            <w:r>
+              <w:rPr>
+                <w:rFonts w:ascii="Liberation Sans" w:hAnsi="Liberation Sans"/>
+                <w:sz w:val="18"/>
+                <w:szCs w:val="18"/>
+              </w:rPr>
+            </w:r>
+          </w:p>
+        </w:tc>
+      </w:tr>
+    </w:tbl>
+    <w:p>
+      <w:pPr>
+        <w:pStyle w:val="Normal"/>
+        <w:rPr/>
+      </w:pPr>
+      <w:r>
+        <w:rPr/>
+      </w:r>
+    </w:p>
+    <w:p>
+      <w:pPr>
+        <w:pStyle w:val="Normal"/>
+        <w:rPr/>
+      </w:pPr>
+      <w:r>
+        <w:rPr/>
+        <w:t>{% endif %}</w:t>
+      </w:r>
+    </w:p>
+    <w:p>
+      <w:pPr>
+        <w:pStyle w:val="Normal"/>
+        <w:rPr/>
+      </w:pPr>
+      <w:r>
+        <w:rPr/>
+      </w:r>
+    </w:p>
+    <w:p>
+      <w:pPr>
+        <w:pStyle w:val="Normal"/>
+        <w:rPr/>
+      </w:pPr>
+      <w:r>
+        <w:rPr/>
         <w:t>{%p endfor %}</w:t>
       </w:r>
     </w:p>
@@ -1205,7 +1429,7 @@
 </file>
 
 <file path=word/footer1.xml><?xml version="1.0" encoding="utf-8"?>
-<w:ftr xmlns:o="urn:schemas-microsoft-com:office:office" xmlns:r="http://schemas.openxmlformats.org/officeDocument/2006/relationships" xmlns:v="urn:schemas-microsoft-com:vml" xmlns:w="http://schemas.openxmlformats.org/wordprocessingml/2006/main" xmlns:w10="urn:schemas-microsoft-com:office:word" xmlns:wp="http://schemas.openxmlformats.org/drawingml/2006/wordprocessingDrawing" xmlns:pic="http://schemas.openxmlformats.org/drawingml/2006/picture" xmlns:wps="http://schemas.microsoft.com/office/word/2010/wordprocessingShape" xmlns:wpg="http://schemas.microsoft.com/office/word/2010/wordprocessingGroup" xmlns:mc="http://schemas.openxmlformats.org/markup-compatibility/2006" xmlns:wp14="http://schemas.microsoft.com/office/word/2010/wordprocessingDrawing" xmlns:w14="http://schemas.microsoft.com/office/word/2010/wordml" xmlns:w15="http://schemas.microsoft.com/office/word/2012/wordml" mc:Ignorable="w14 wp14 w15">
+<w:ftr xmlns:o="urn:schemas-microsoft-com:office:office" xmlns:r="http://schemas.openxmlformats.org/officeDocument/2006/relationships" xmlns:v="urn:schemas-microsoft-com:vml" xmlns:w="http://schemas.openxmlformats.org/wordprocessingml/2006/main" xmlns:w10="urn:schemas-microsoft-com:office:word" xmlns:wp="http://schemas.openxmlformats.org/drawingml/2006/wordprocessingDrawing" xmlns:wps="http://schemas.microsoft.com/office/word/2010/wordprocessingShape" xmlns:wpg="http://schemas.microsoft.com/office/word/2010/wordprocessingGroup" xmlns:mc="http://schemas.openxmlformats.org/markup-compatibility/2006" xmlns:wp14="http://schemas.microsoft.com/office/word/2010/wordprocessingDrawing" xmlns:w14="http://schemas.microsoft.com/office/word/2010/wordml" xmlns:w15="http://schemas.microsoft.com/office/word/2012/wordml" mc:Ignorable="w14 wp14 w15">
   <w:p>
     <w:pPr>
       <w:pStyle w:val="Footer"/>
@@ -1219,7 +1443,7 @@
 </file>
 
 <file path=word/footer2.xml><?xml version="1.0" encoding="utf-8"?>
-<w:ftr xmlns:o="urn:schemas-microsoft-com:office:office" xmlns:r="http://schemas.openxmlformats.org/officeDocument/2006/relationships" xmlns:v="urn:schemas-microsoft-com:vml" xmlns:w="http://schemas.openxmlformats.org/wordprocessingml/2006/main" xmlns:w10="urn:schemas-microsoft-com:office:word" xmlns:wp="http://schemas.openxmlformats.org/drawingml/2006/wordprocessingDrawing" xmlns:pic="http://schemas.openxmlformats.org/drawingml/2006/picture" xmlns:wps="http://schemas.microsoft.com/office/word/2010/wordprocessingShape" xmlns:wpg="http://schemas.microsoft.com/office/word/2010/wordprocessingGroup" xmlns:mc="http://schemas.openxmlformats.org/markup-compatibility/2006" xmlns:wp14="http://schemas.microsoft.com/office/word/2010/wordprocessingDrawing" xmlns:w14="http://schemas.microsoft.com/office/word/2010/wordml" xmlns:w15="http://schemas.microsoft.com/office/word/2012/wordml" mc:Ignorable="w14 wp14 w15">
+<w:ftr xmlns:o="urn:schemas-microsoft-com:office:office" xmlns:r="http://schemas.openxmlformats.org/officeDocument/2006/relationships" xmlns:v="urn:schemas-microsoft-com:vml" xmlns:w="http://schemas.openxmlformats.org/wordprocessingml/2006/main" xmlns:w10="urn:schemas-microsoft-com:office:word" xmlns:wp="http://schemas.openxmlformats.org/drawingml/2006/wordprocessingDrawing" xmlns:wps="http://schemas.microsoft.com/office/word/2010/wordprocessingShape" xmlns:wpg="http://schemas.microsoft.com/office/word/2010/wordprocessingGroup" xmlns:mc="http://schemas.openxmlformats.org/markup-compatibility/2006" xmlns:wp14="http://schemas.microsoft.com/office/word/2010/wordprocessingDrawing" xmlns:w14="http://schemas.microsoft.com/office/word/2010/wordml" xmlns:w15="http://schemas.microsoft.com/office/word/2012/wordml" mc:Ignorable="w14 wp14 w15">
   <w:p>
     <w:pPr>
       <w:pStyle w:val="Footer"/>
@@ -1241,7 +1465,7 @@
     </w:r>
     <w:r>
       <w:rPr/>
-      <w:t>2</w:t>
+      <w:t>4</w:t>
     </w:r>
     <w:r>
       <w:rPr/>
@@ -1269,7 +1493,7 @@
     </w:r>
     <w:r>
       <w:rPr/>
-      <w:t>3</w:t>
+      <w:t>4</w:t>
     </w:r>
     <w:r>
       <w:rPr/>
@@ -1285,7 +1509,7 @@
 </file>
 
 <file path=word/footer3.xml><?xml version="1.0" encoding="utf-8"?>
-<w:ftr xmlns:o="urn:schemas-microsoft-com:office:office" xmlns:r="http://schemas.openxmlformats.org/officeDocument/2006/relationships" xmlns:v="urn:schemas-microsoft-com:vml" xmlns:w="http://schemas.openxmlformats.org/wordprocessingml/2006/main" xmlns:w10="urn:schemas-microsoft-com:office:word" xmlns:wp="http://schemas.openxmlformats.org/drawingml/2006/wordprocessingDrawing" xmlns:pic="http://schemas.openxmlformats.org/drawingml/2006/picture" xmlns:wps="http://schemas.microsoft.com/office/word/2010/wordprocessingShape" xmlns:wpg="http://schemas.microsoft.com/office/word/2010/wordprocessingGroup" xmlns:mc="http://schemas.openxmlformats.org/markup-compatibility/2006" xmlns:wp14="http://schemas.microsoft.com/office/word/2010/wordprocessingDrawing" xmlns:w14="http://schemas.microsoft.com/office/word/2010/wordml" xmlns:w15="http://schemas.microsoft.com/office/word/2012/wordml" mc:Ignorable="w14 wp14 w15">
+<w:ftr xmlns:o="urn:schemas-microsoft-com:office:office" xmlns:r="http://schemas.openxmlformats.org/officeDocument/2006/relationships" xmlns:v="urn:schemas-microsoft-com:vml" xmlns:w="http://schemas.openxmlformats.org/wordprocessingml/2006/main" xmlns:w10="urn:schemas-microsoft-com:office:word" xmlns:wp="http://schemas.openxmlformats.org/drawingml/2006/wordprocessingDrawing" xmlns:wps="http://schemas.microsoft.com/office/word/2010/wordprocessingShape" xmlns:wpg="http://schemas.microsoft.com/office/word/2010/wordprocessingGroup" xmlns:mc="http://schemas.openxmlformats.org/markup-compatibility/2006" xmlns:wp14="http://schemas.microsoft.com/office/word/2010/wordprocessingDrawing" xmlns:w14="http://schemas.microsoft.com/office/word/2010/wordml" xmlns:w15="http://schemas.microsoft.com/office/word/2012/wordml" mc:Ignorable="w14 wp14 w15">
   <w:p>
     <w:pPr>
       <w:pStyle w:val="Footer"/>
@@ -1307,7 +1531,7 @@
     </w:r>
     <w:r>
       <w:rPr/>
-      <w:t>2</w:t>
+      <w:t>4</w:t>
     </w:r>
     <w:r>
       <w:rPr/>
@@ -1335,7 +1559,7 @@
     </w:r>
     <w:r>
       <w:rPr/>
-      <w:t>3</w:t>
+      <w:t>4</w:t>
     </w:r>
     <w:r>
       <w:rPr/>
@@ -1351,7 +1575,7 @@
 </file>
 
 <file path=word/header1.xml><?xml version="1.0" encoding="utf-8"?>
-<w:hdr xmlns:o="urn:schemas-microsoft-com:office:office" xmlns:r="http://schemas.openxmlformats.org/officeDocument/2006/relationships" xmlns:v="urn:schemas-microsoft-com:vml" xmlns:w="http://schemas.openxmlformats.org/wordprocessingml/2006/main" xmlns:w10="urn:schemas-microsoft-com:office:word" xmlns:wp="http://schemas.openxmlformats.org/drawingml/2006/wordprocessingDrawing" xmlns:pic="http://schemas.openxmlformats.org/drawingml/2006/picture" xmlns:wps="http://schemas.microsoft.com/office/word/2010/wordprocessingShape" xmlns:wpg="http://schemas.microsoft.com/office/word/2010/wordprocessingGroup" xmlns:mc="http://schemas.openxmlformats.org/markup-compatibility/2006" xmlns:wp14="http://schemas.microsoft.com/office/word/2010/wordprocessingDrawing" xmlns:w14="http://schemas.microsoft.com/office/word/2010/wordml" xmlns:w15="http://schemas.microsoft.com/office/word/2012/wordml" mc:Ignorable="w14 wp14 w15">
+<w:hdr xmlns:o="urn:schemas-microsoft-com:office:office" xmlns:r="http://schemas.openxmlformats.org/officeDocument/2006/relationships" xmlns:v="urn:schemas-microsoft-com:vml" xmlns:w="http://schemas.openxmlformats.org/wordprocessingml/2006/main" xmlns:w10="urn:schemas-microsoft-com:office:word" xmlns:wp="http://schemas.openxmlformats.org/drawingml/2006/wordprocessingDrawing" xmlns:wps="http://schemas.microsoft.com/office/word/2010/wordprocessingShape" xmlns:wpg="http://schemas.microsoft.com/office/word/2010/wordprocessingGroup" xmlns:mc="http://schemas.openxmlformats.org/markup-compatibility/2006" xmlns:wp14="http://schemas.microsoft.com/office/word/2010/wordprocessingDrawing" xmlns:w14="http://schemas.microsoft.com/office/word/2010/wordml" xmlns:w15="http://schemas.microsoft.com/office/word/2012/wordml" mc:Ignorable="w14 wp14 w15">
   <w:p>
     <w:pPr>
       <w:pStyle w:val="Header"/>
@@ -1365,7 +1589,7 @@
 </file>
 
 <file path=word/header2.xml><?xml version="1.0" encoding="utf-8"?>
-<w:hdr xmlns:o="urn:schemas-microsoft-com:office:office" xmlns:r="http://schemas.openxmlformats.org/officeDocument/2006/relationships" xmlns:v="urn:schemas-microsoft-com:vml" xmlns:w="http://schemas.openxmlformats.org/wordprocessingml/2006/main" xmlns:w10="urn:schemas-microsoft-com:office:word" xmlns:wp="http://schemas.openxmlformats.org/drawingml/2006/wordprocessingDrawing" xmlns:pic="http://schemas.openxmlformats.org/drawingml/2006/picture" xmlns:wps="http://schemas.microsoft.com/office/word/2010/wordprocessingShape" xmlns:wpg="http://schemas.microsoft.com/office/word/2010/wordprocessingGroup" xmlns:mc="http://schemas.openxmlformats.org/markup-compatibility/2006" xmlns:wp14="http://schemas.microsoft.com/office/word/2010/wordprocessingDrawing" xmlns:w14="http://schemas.microsoft.com/office/word/2010/wordml" xmlns:w15="http://schemas.microsoft.com/office/word/2012/wordml" mc:Ignorable="w14 wp14 w15">
+<w:hdr xmlns:o="urn:schemas-microsoft-com:office:office" xmlns:r="http://schemas.openxmlformats.org/officeDocument/2006/relationships" xmlns:v="urn:schemas-microsoft-com:vml" xmlns:w="http://schemas.openxmlformats.org/wordprocessingml/2006/main" xmlns:w10="urn:schemas-microsoft-com:office:word" xmlns:wp="http://schemas.openxmlformats.org/drawingml/2006/wordprocessingDrawing" xmlns:wps="http://schemas.microsoft.com/office/word/2010/wordprocessingShape" xmlns:wpg="http://schemas.microsoft.com/office/word/2010/wordprocessingGroup" xmlns:mc="http://schemas.openxmlformats.org/markup-compatibility/2006" xmlns:wp14="http://schemas.microsoft.com/office/word/2010/wordprocessingDrawing" xmlns:w14="http://schemas.microsoft.com/office/word/2010/wordml" xmlns:w15="http://schemas.microsoft.com/office/word/2012/wordml" mc:Ignorable="w14 wp14 w15">
   <w:p>
     <w:pPr>
       <w:pStyle w:val="Header"/>
@@ -1379,7 +1603,7 @@
       <mc:AlternateContent>
         <mc:Choice Requires="wps">
           <w:drawing>
-            <wp:anchor behindDoc="1" distT="0" distB="0" distL="0" distR="0" simplePos="0" locked="0" layoutInCell="0" allowOverlap="1" relativeHeight="4">
+            <wp:anchor behindDoc="1" distT="0" distB="0" distL="0" distR="0" simplePos="0" locked="0" layoutInCell="1" allowOverlap="1" relativeHeight="7">
               <wp:simplePos x="0" y="0"/>
               <wp:positionH relativeFrom="column">
                 <wp:align>right</wp:align>
@@ -1480,7 +1704,7 @@
         </mc:Fallback>
       </mc:AlternateContent>
       <w:drawing>
-        <wp:anchor behindDoc="1" distT="0" distB="0" distL="0" distR="0" simplePos="0" locked="0" layoutInCell="0" allowOverlap="1" relativeHeight="7">
+        <wp:anchor behindDoc="1" distT="0" distB="0" distL="0" distR="0" simplePos="0" locked="0" layoutInCell="0" allowOverlap="1" relativeHeight="11">
           <wp:simplePos x="0" y="0"/>
           <wp:positionH relativeFrom="column">
             <wp:posOffset>0</wp:posOffset>
@@ -1518,7 +1742,6 @@
                   <a:prstGeom prst="rect">
                     <a:avLst/>
                   </a:prstGeom>
-                  <a:noFill/>
                 </pic:spPr>
               </pic:pic>
             </a:graphicData>
@@ -1531,7 +1754,7 @@
 </file>
 
 <file path=word/header3.xml><?xml version="1.0" encoding="utf-8"?>
-<w:hdr xmlns:o="urn:schemas-microsoft-com:office:office" xmlns:r="http://schemas.openxmlformats.org/officeDocument/2006/relationships" xmlns:v="urn:schemas-microsoft-com:vml" xmlns:w="http://schemas.openxmlformats.org/wordprocessingml/2006/main" xmlns:w10="urn:schemas-microsoft-com:office:word" xmlns:wp="http://schemas.openxmlformats.org/drawingml/2006/wordprocessingDrawing" xmlns:pic="http://schemas.openxmlformats.org/drawingml/2006/picture" xmlns:wps="http://schemas.microsoft.com/office/word/2010/wordprocessingShape" xmlns:wpg="http://schemas.microsoft.com/office/word/2010/wordprocessingGroup" xmlns:mc="http://schemas.openxmlformats.org/markup-compatibility/2006" xmlns:wp14="http://schemas.microsoft.com/office/word/2010/wordprocessingDrawing" xmlns:w14="http://schemas.microsoft.com/office/word/2010/wordml" xmlns:w15="http://schemas.microsoft.com/office/word/2012/wordml" mc:Ignorable="w14 wp14 w15">
+<w:hdr xmlns:o="urn:schemas-microsoft-com:office:office" xmlns:r="http://schemas.openxmlformats.org/officeDocument/2006/relationships" xmlns:v="urn:schemas-microsoft-com:vml" xmlns:w="http://schemas.openxmlformats.org/wordprocessingml/2006/main" xmlns:w10="urn:schemas-microsoft-com:office:word" xmlns:wp="http://schemas.openxmlformats.org/drawingml/2006/wordprocessingDrawing" xmlns:wps="http://schemas.microsoft.com/office/word/2010/wordprocessingShape" xmlns:wpg="http://schemas.microsoft.com/office/word/2010/wordprocessingGroup" xmlns:mc="http://schemas.openxmlformats.org/markup-compatibility/2006" xmlns:wp14="http://schemas.microsoft.com/office/word/2010/wordprocessingDrawing" xmlns:w14="http://schemas.microsoft.com/office/word/2010/wordml" xmlns:w15="http://schemas.microsoft.com/office/word/2012/wordml" mc:Ignorable="w14 wp14 w15">
   <w:p>
     <w:pPr>
       <w:pStyle w:val="Header"/>
@@ -1545,7 +1768,7 @@
       <mc:AlternateContent>
         <mc:Choice Requires="wps">
           <w:drawing>
-            <wp:anchor behindDoc="1" distT="0" distB="0" distL="0" distR="0" simplePos="0" locked="0" layoutInCell="0" allowOverlap="1" relativeHeight="4">
+            <wp:anchor behindDoc="1" distT="0" distB="0" distL="0" distR="0" simplePos="0" locked="0" layoutInCell="1" allowOverlap="1" relativeHeight="7">
               <wp:simplePos x="0" y="0"/>
               <wp:positionH relativeFrom="column">
                 <wp:align>right</wp:align>
@@ -1646,7 +1869,7 @@
         </mc:Fallback>
       </mc:AlternateContent>
       <w:drawing>
-        <wp:anchor behindDoc="1" distT="0" distB="0" distL="0" distR="0" simplePos="0" locked="0" layoutInCell="0" allowOverlap="1" relativeHeight="7">
+        <wp:anchor behindDoc="1" distT="0" distB="0" distL="0" distR="0" simplePos="0" locked="0" layoutInCell="0" allowOverlap="1" relativeHeight="11">
           <wp:simplePos x="0" y="0"/>
           <wp:positionH relativeFrom="column">
             <wp:posOffset>0</wp:posOffset>
@@ -1684,7 +1907,6 @@
                   <a:prstGeom prst="rect">
                     <a:avLst/>
                   </a:prstGeom>
-                  <a:noFill/>
                 </pic:spPr>
               </pic:pic>
             </a:graphicData>
@@ -2516,7 +2738,7 @@
     </w:rPr>
   </w:style>
   <w:style w:type="paragraph" w:styleId="Heading1">
-    <w:name w:val="heading 1"/>
+    <w:name w:val="Heading 1"/>
     <w:basedOn w:val="Heading"/>
     <w:next w:val="BodyText"/>
     <w:qFormat/>
@@ -2536,7 +2758,7 @@
     </w:rPr>
   </w:style>
   <w:style w:type="paragraph" w:styleId="Heading2">
-    <w:name w:val="heading 2"/>
+    <w:name w:val="Heading 2"/>
     <w:basedOn w:val="Heading"/>
     <w:next w:val="BodyText"/>
     <w:qFormat/>
@@ -2556,7 +2778,7 @@
     </w:rPr>
   </w:style>
   <w:style w:type="paragraph" w:styleId="Heading3">
-    <w:name w:val="heading 3"/>
+    <w:name w:val="Heading 3"/>
     <w:basedOn w:val="Heading"/>
     <w:qFormat/>
     <w:pPr>
@@ -2577,7 +2799,7 @@
     </w:rPr>
   </w:style>
   <w:style w:type="paragraph" w:styleId="Heading4">
-    <w:name w:val="heading 4"/>
+    <w:name w:val="Heading 4"/>
     <w:basedOn w:val="Heading"/>
     <w:next w:val="BodyText"/>
     <w:qFormat/>
@@ -2631,7 +2853,7 @@
     </w:rPr>
   </w:style>
   <w:style w:type="paragraph" w:styleId="Caption">
-    <w:name w:val="caption"/>
+    <w:name w:val="Caption"/>
     <w:basedOn w:val="Normal"/>
     <w:qFormat/>
     <w:pPr>
@@ -2687,7 +2909,7 @@
     <w:rPr/>
   </w:style>
   <w:style w:type="paragraph" w:styleId="EnvelopeReturn">
-    <w:name w:val="envelope return"/>
+    <w:name w:val="Envelope Return"/>
     <w:basedOn w:val="Normal"/>
     <w:pPr>
       <w:suppressLineNumbers/>
@@ -2766,7 +2988,7 @@
     <w:rPr/>
   </w:style>
   <w:style w:type="paragraph" w:styleId="Header">
-    <w:name w:val="header"/>
+    <w:name w:val="Header"/>
     <w:basedOn w:val="HeaderandFooter"/>
     <w:pPr>
       <w:suppressLineNumbers/>
@@ -2774,7 +2996,7 @@
     <w:rPr/>
   </w:style>
   <w:style w:type="paragraph" w:styleId="Footer">
-    <w:name w:val="footer"/>
+    <w:name w:val="Footer"/>
     <w:basedOn w:val="HeaderandFooter"/>
     <w:pPr>
       <w:suppressLineNumbers/>
@@ -2783,13 +3005,6 @@
   </w:style>
   <w:style w:type="paragraph" w:styleId="FrameContents">
     <w:name w:val="Frame Contents"/>
-    <w:basedOn w:val="Normal"/>
-    <w:qFormat/>
-    <w:pPr/>
-    <w:rPr/>
-  </w:style>
-  <w:style w:type="paragraph" w:styleId="FrameContentsuser">
-    <w:name w:val="Frame Contents (user)"/>
     <w:basedOn w:val="Normal"/>
     <w:qFormat/>
     <w:pPr/>

</xml_diff>